<commit_message>
Bổ sung cột Tác dụng cụ thể cho bảng đề xuất RESEARCH-ecc
Mỗi đề xuất E1-E8 giờ nêu rõ trạng thái trước/sau khi áp dụng và
cách đo được hiệu quả, thay vì chỉ nêu lợi ích chung.
</commit_message>
<xml_diff>
--- a/docs/research/RESEARCH-ecc-2026-07-12.docx
+++ b/docs/research/RESEARCH-ecc-2026-07-12.docx
@@ -2047,7 +2047,7 @@
               <w:rPr>
                 <w:sz w:val="20"/>
               </w:rPr>
-              <w:t>Stars</w:t>
+              <w:t>Stars / Forks / Contributors</w:t>
             </w:r>
           </w:p>
         </w:tc>
@@ -2064,91 +2064,16 @@
           <w:p>
             <w:r>
               <w:rPr>
+                <w:i/>
                 <w:sz w:val="20"/>
               </w:rPr>
-              <w:t>211.9K+</w:t>
+              <w:t>Không xác minh được</w:t>
             </w:r>
-          </w:p>
-        </w:tc>
-      </w:tr>
-      <w:tr>
-        <w:tc>
-          <w:tcPr>
-            <w:tcW w:type="dxa" w:w="4844"/>
-            <w:shd w:val="clear" w:color="auto" w:fill="B8B3D6"/>
-            <w:tcBorders>
-              <w:top w:val="single" w:sz="4" w:space="0" w:color="CBCBCB"/>
-              <w:left w:val="single" w:sz="4" w:space="0" w:color="CBCBCB"/>
-              <w:bottom w:val="single" w:sz="4" w:space="0" w:color="CBCBCB"/>
-              <w:right w:val="single" w:sz="4" w:space="0" w:color="CBCBCB"/>
-            </w:tcBorders>
-          </w:tcPr>
-          <w:p>
             <w:r>
               <w:rPr>
                 <w:sz w:val="20"/>
               </w:rPr>
-              <w:t>Forks</w:t>
-            </w:r>
-          </w:p>
-        </w:tc>
-        <w:tc>
-          <w:tcPr>
-            <w:tcW w:type="dxa" w:w="4844"/>
-            <w:shd w:val="clear" w:color="auto" w:fill="B8B3D6"/>
-            <w:tcBorders>
-              <w:top w:val="single" w:sz="4" w:space="0" w:color="CBCBCB"/>
-              <w:left w:val="single" w:sz="4" w:space="0" w:color="CBCBCB"/>
-              <w:bottom w:val="single" w:sz="4" w:space="0" w:color="CBCBCB"/>
-              <w:right w:val="single" w:sz="4" w:space="0" w:color="CBCBCB"/>
-            </w:tcBorders>
-          </w:tcPr>
-          <w:p>
-            <w:r>
-              <w:rPr>
-                <w:sz w:val="20"/>
-              </w:rPr>
-              <w:t>32.5K+</w:t>
-            </w:r>
-          </w:p>
-        </w:tc>
-      </w:tr>
-      <w:tr>
-        <w:tc>
-          <w:tcPr>
-            <w:tcW w:type="dxa" w:w="4844"/>
-            <w:tcBorders>
-              <w:top w:val="single" w:sz="4" w:space="0" w:color="CBCBCB"/>
-              <w:left w:val="single" w:sz="4" w:space="0" w:color="CBCBCB"/>
-              <w:bottom w:val="single" w:sz="4" w:space="0" w:color="CBCBCB"/>
-              <w:right w:val="single" w:sz="4" w:space="0" w:color="CBCBCB"/>
-            </w:tcBorders>
-          </w:tcPr>
-          <w:p>
-            <w:r>
-              <w:rPr>
-                <w:sz w:val="20"/>
-              </w:rPr>
-              <w:t>Contributors</w:t>
-            </w:r>
-          </w:p>
-        </w:tc>
-        <w:tc>
-          <w:tcPr>
-            <w:tcW w:type="dxa" w:w="4844"/>
-            <w:tcBorders>
-              <w:top w:val="single" w:sz="4" w:space="0" w:color="CBCBCB"/>
-              <w:left w:val="single" w:sz="4" w:space="0" w:color="CBCBCB"/>
-              <w:bottom w:val="single" w:sz="4" w:space="0" w:color="CBCBCB"/>
-              <w:right w:val="single" w:sz="4" w:space="0" w:color="CBCBCB"/>
-            </w:tcBorders>
-          </w:tcPr>
-          <w:p>
-            <w:r>
-              <w:rPr>
-                <w:sz w:val="20"/>
-              </w:rPr>
-              <w:t>230+</w:t>
+              <w:t xml:space="preserve"> — README dòng 28 tự khai "211.9K+ stars, 32.5K+ forks, 230+ contributors", nhưng đây là text tĩnh do tác giả viết (không lấy từ GitHub API), và tự mâu thuẫn với dòng khác trong cùng README ("30+ contributors" ở phần changelog release notes). KHÔNG dùng số liệu này làm căn cứ đánh giá độ phổ biến/uy tín repo.</w:t>
             </w:r>
           </w:p>
         </w:tc>
@@ -2274,7 +2199,7 @@
               <w:rPr>
                 <w:sz w:val="20"/>
               </w:rPr>
-              <w:t>Cao — 10+ tháng phát triển thực tế, active community</w:t>
+              <w:t>Chưa xác định độc lập — dựa trên nội dung repo (v2.0.0, changelog chi tiết, cấu trúc code hoàn chỉnh) cho thấy đầu tư nghiêm túc, nhưng số liệu "active community" trong README không được cross-check qua GitHub API thật</w:t>
             </w:r>
           </w:p>
         </w:tc>
@@ -2493,7 +2418,7 @@
                 <w:color w:val="FFFFFF"/>
                 <w:sz w:val="20"/>
               </w:rPr>
-              <w:t>Lợi ích</w:t>
+              <w:t>Tác dụng cụ thể (trước → sau khi áp dụng)</w:t>
             </w:r>
           </w:p>
         </w:tc>
@@ -2634,7 +2559,7 @@
               <w:rPr>
                 <w:sz w:val="20"/>
               </w:rPr>
-              <w:t>---------</w:t>
+              <w:t>---------------------------------------------</w:t>
             </w:r>
           </w:p>
         </w:tc>
@@ -2873,9 +2798,57 @@
           <w:p>
             <w:r>
               <w:rPr>
+                <w:b/>
                 <w:sz w:val="20"/>
               </w:rPr>
-              <w:t>Ngăn agent vô tình yếu hóa config lint/format khi gặp error; ép fix code thay vì fix config</w:t>
+              <w:t>Trước:</w:t>
+            </w:r>
+            <w:r>
+              <w:rPr>
+                <w:sz w:val="20"/>
+              </w:rPr>
+              <w:t xml:space="preserve"> khi agent gặp lỗi lint/build do rule config quá strict, agent có thể tự sửa </w:t>
+            </w:r>
+            <w:r>
+              <w:rPr>
+                <w:rFonts w:ascii="Courier New" w:hAnsi="Courier New"/>
+                <w:color w:val="F05922"/>
+                <w:sz w:val="20"/>
+              </w:rPr>
+              <w:t>.eslintrc</w:t>
+            </w:r>
+            <w:r>
+              <w:rPr>
+                <w:sz w:val="20"/>
+              </w:rPr>
+              <w:t>/</w:t>
+            </w:r>
+            <w:r>
+              <w:rPr>
+                <w:rFonts w:ascii="Courier New" w:hAnsi="Courier New"/>
+                <w:color w:val="F05922"/>
+                <w:sz w:val="20"/>
+              </w:rPr>
+              <w:t>appsettings.json</w:t>
+            </w:r>
+            <w:r>
+              <w:rPr>
+                <w:sz w:val="20"/>
+              </w:rPr>
+              <w:t xml:space="preserve"> để "cho qua" lỗi mà không ai để ý. </w:t>
+            </w:r>
+            <w:r>
+              <w:rPr>
+                <w:b/>
+                <w:sz w:val="20"/>
+              </w:rPr>
+              <w:t>Sau:</w:t>
+            </w:r>
+            <w:r>
+              <w:rPr>
+                <w:sz w:val="20"/>
+              </w:rPr>
+              <w:t xml:space="preserve"> hook chặn ngay lệnh Edit/Write nhắm vào file nằm trong danh sách bảo vệ — lệnh bị exit non-zero, agent buộc phải quay lại sửa code nguồn hoặc giải thích rõ lý do cho user trước khi tiếp tục. Đo được bằng: thử cho agent sửa 1 rule ESLint để test → phải bị block.</w:t>
             </w:r>
           </w:p>
         </w:tc>
@@ -3061,9 +3034,29 @@
           <w:p>
             <w:r>
               <w:rPr>
+                <w:b/>
                 <w:sz w:val="20"/>
               </w:rPr>
-              <w:t>Ngăn regression lặp lại; rút ngắn onboarding cho contributor mới; giảm thời gian debug</w:t>
+              <w:t>Trước:</w:t>
+            </w:r>
+            <w:r>
+              <w:rPr>
+                <w:sz w:val="20"/>
+              </w:rPr>
+              <w:t xml:space="preserve"> lỗi "ngầm" đã gặp và fix 1 lần (VD: PDF export lỗi vì thiếu LibreOffice — vừa gặp trong task này) không được ghi ở đâu cả, agent/session sau lặp lại đúng lỗi đó, tốn thời gian debug lại từ đầu. </w:t>
+            </w:r>
+            <w:r>
+              <w:rPr>
+                <w:b/>
+                <w:sz w:val="20"/>
+              </w:rPr>
+              <w:t>Sau:</w:t>
+            </w:r>
+            <w:r>
+              <w:rPr>
+                <w:sz w:val="20"/>
+              </w:rPr>
+              <w:t xml:space="preserve"> mỗi lần fix xong 1 lỗi ngầm, agent PHẢI thêm 1 dòng vào GOTCHAS.md; agent sau khi gặp lỗi tương tự chỉ cần đọc file này 30 giây thay vì debug lại 30 phút. Đo được bằng: đếm số lần cùng 1 lỗi ngầm lặp lại qua các session trước/sau khi có file.</w:t>
             </w:r>
           </w:p>
         </w:tc>
@@ -3244,9 +3237,29 @@
           <w:p>
             <w:r>
               <w:rPr>
+                <w:b/>
                 <w:sz w:val="20"/>
               </w:rPr>
-              <w:t>Giảm context window waste; session bắt đầu nhanh hơn; agent ít bị distract bởi skill không liên quan</w:t>
+              <w:t>Trước:</w:t>
+            </w:r>
+            <w:r>
+              <w:rPr>
+                <w:sz w:val="20"/>
+              </w:rPr>
+              <w:t xml:space="preserve"> mỗi turn, system-reminder liệt kê description đầy đủ của TẤT CẢ 17 agent (kể cả code-migrator, github-repo-researcher — chỉ dùng vài lần/tháng) — tốn token cố định mỗi lượt chat dù không dùng đến. </w:t>
+            </w:r>
+            <w:r>
+              <w:rPr>
+                <w:b/>
+                <w:sz w:val="20"/>
+              </w:rPr>
+              <w:t>Sau:</w:t>
+            </w:r>
+            <w:r>
+              <w:rPr>
+                <w:sz w:val="20"/>
+              </w:rPr>
+              <w:t xml:space="preserve"> chỉ agent DAILY xuất hiện mặc định; agent LIBRARY được load qua ToolSearch/kích hoạt rõ ràng khi match trigger từ khóa. Đo được bằng: so sánh số token trong system-reminder trước/sau (ước tính giảm ~30-40% phần liệt kê agent).</w:t>
             </w:r>
           </w:p>
         </w:tc>
@@ -3266,7 +3279,7 @@
               <w:rPr>
                 <w:sz w:val="20"/>
               </w:rPr>
-              <w:t>Trung bình — cần rà soát 17+ agents. Effort: 4-6h</w:t>
+              <w:t>Trung bình — cần rà soát 17+ agents, rủi ro: phân loại sai khiến 1 agent cần dùng nhưng không hiện ra khi Dispatcher routing. Effort: 4-6h</w:t>
             </w:r>
           </w:p>
         </w:tc>
@@ -3452,9 +3465,29 @@
           <w:p>
             <w:r>
               <w:rPr>
+                <w:b/>
                 <w:sz w:val="20"/>
               </w:rPr>
-              <w:t>Agent không đẩy code broken lên cho Tech Lead review; tiết kiệm thời gian review; giảm back-and-forth</w:t>
+              <w:t>Trước:</w:t>
+            </w:r>
+            <w:r>
+              <w:rPr>
+                <w:sz w:val="20"/>
+              </w:rPr>
+              <w:t xml:space="preserve"> Senior/Junior Dev báo "xong" và đẩy thẳng cho Tech Lead review — TL tự chạy build/test, phát hiện lỗi cơ bản (build fail, test fail) mới trả lại, mất 1 vòng review vô ích. </w:t>
+            </w:r>
+            <w:r>
+              <w:rPr>
+                <w:b/>
+                <w:sz w:val="20"/>
+              </w:rPr>
+              <w:t>Sau:</w:t>
+            </w:r>
+            <w:r>
+              <w:rPr>
+                <w:sz w:val="20"/>
+              </w:rPr>
+              <w:t xml:space="preserve"> Dev PHẢI đính kèm VERIFICATION REPORT (build/lint/test: pass/fail) vào PR description; nếu có mục FAIL, PR không được coi là sẵn sàng review — TL chỉ mở review khi report toàn PASS. Đo được bằng: số PR bị TL trả về do lỗi build/test cơ bản giảm về 0.</w:t>
             </w:r>
           </w:p>
         </w:tc>
@@ -3621,9 +3654,29 @@
           <w:p>
             <w:r>
               <w:rPr>
+                <w:b/>
                 <w:sz w:val="20"/>
               </w:rPr>
-              <w:t>Có thước đo khách quan cho agent quality; phát hiện regression sớm khi sửa CLAUDE.md; onboarding dễ hơn</w:t>
+              <w:t>Trước:</w:t>
+            </w:r>
+            <w:r>
+              <w:rPr>
+                <w:sz w:val="20"/>
+              </w:rPr>
+              <w:t xml:space="preserve"> agent mới (VD: agent đề xuất ở §18 CLAUDE.md) được coi "xong" chỉ vì chạy 1 lần không lỗi cú pháp — không ai kiểm tra agent có thực sự làm đúng domain của nó ở nhiều tình huống khác nhau. </w:t>
+            </w:r>
+            <w:r>
+              <w:rPr>
+                <w:b/>
+                <w:sz w:val="20"/>
+              </w:rPr>
+              <w:t>Sau:</w:t>
+            </w:r>
+            <w:r>
+              <w:rPr>
+                <w:sz w:val="20"/>
+              </w:rPr>
+              <w:t xml:space="preserve"> trước khi merge agent mới, phải có ≥3 ví dụ input/output mong đợi và agent phải pass hầu hết trong số đó mới được coi hoàn thành; khi sửa CLAUDE.md sau này, chạy lại các eval cũ để phát hiện agent có bị regression không. Đo được bằng: agent mới có file eval kèm log pass/fail trước khi được thêm vào routing table.</w:t>
             </w:r>
           </w:p>
         </w:tc>
@@ -3789,9 +3842,29 @@
           <w:p>
             <w:r>
               <w:rPr>
+                <w:b/>
                 <w:sz w:val="20"/>
               </w:rPr>
-              <w:t>Giảm token waste khi agent loop; recovery có hệ thống thay vì heuristic; report giúp session tiếp theo không phải debug lại</w:t>
+              <w:t>Trước:</w:t>
+            </w:r>
+            <w:r>
+              <w:rPr>
+                <w:sz w:val="20"/>
+              </w:rPr>
+              <w:t xml:space="preserve"> khi 1 agent gọi lặp cùng 1 tool nhiều lần không tiến triển (VD: build fail liên tục vì thiếu dependency), Dispatcher/agent hoặc tự retry mù hoặc phải tự suy luận lại từ đầu — tốn token, có thể lặp vô hạn. </w:t>
+            </w:r>
+            <w:r>
+              <w:rPr>
+                <w:b/>
+                <w:sz w:val="20"/>
+              </w:rPr>
+              <w:t>Sau:</w:t>
+            </w:r>
+            <w:r>
+              <w:rPr>
+                <w:sz w:val="20"/>
+              </w:rPr>
+              <w:t xml:space="preserve"> phát hiện loop → dừng ngay, ghi lại lỗi cụ thể + tool call cuối, tra bảng pattern lỗi đã biết, thử 1 hành động nhỏ có thể rollback, rồi báo cáo user thay vì im lặng retry. Đo được bằng: số turn agent bị "loop" trước khi có người/cơ chế can thiệp giảm từ nhiều chục xuống 1-2.</w:t>
             </w:r>
           </w:p>
         </w:tc>
@@ -3960,9 +4033,29 @@
           <w:p>
             <w:r>
               <w:rPr>
+                <w:b/>
                 <w:sz w:val="20"/>
               </w:rPr>
-              <w:t>Tránh mất context ở giữa multi-phase task; session chất lượng hơn khi context không bị compact mid-work</w:t>
+              <w:t>Trước:</w:t>
+            </w:r>
+            <w:r>
+              <w:rPr>
+                <w:sz w:val="20"/>
+              </w:rPr>
+              <w:t xml:space="preserve"> context window tự bị nén (auto-compact) tại thời điểm bất kỳ, có thể đúng giữa lúc agent đang thực hiện 1 bước nhiều-turn (VD: đang debug 1 lỗi phức tạp) — mất chi tiết quan trọng giữa việc. </w:t>
+            </w:r>
+            <w:r>
+              <w:rPr>
+                <w:b/>
+                <w:sz w:val="20"/>
+              </w:rPr>
+              <w:t>Sau:</w:t>
+            </w:r>
+            <w:r>
+              <w:rPr>
+                <w:sz w:val="20"/>
+              </w:rPr>
+              <w:t xml:space="preserve"> hệ thống chủ động cảnh báo "nên compact ngay" tại điểm vừa hoàn thành 1 bước/1 phase rõ ràng (logical boundary), trước khi context đầy — tránh mất ngữ cảnh giữa việc dở dang. Đo được bằng: giảm số lần agent phải "đọc lại" cùng 1 file/quyết định sau một lần auto-compact bất ngờ.</w:t>
             </w:r>
           </w:p>
         </w:tc>
@@ -3982,7 +4075,7 @@
               <w:rPr>
                 <w:sz w:val="20"/>
               </w:rPr>
-              <w:t>Trung bình — cần viết script Node.js hoặc Python đơn giản. Effort: 3-4h</w:t>
+              <w:t>Trung bình — cần viết script Node.js hoặc Python đơn giản; phụ thuộc việc KZTEK có Node.js sẵn. Effort: 3-4h</w:t>
             </w:r>
           </w:p>
         </w:tc>
@@ -4076,21 +4169,7 @@
               <w:rPr>
                 <w:sz w:val="20"/>
               </w:rPr>
-              <w:t xml:space="preserve"> dependency graph: runtime-core → workflow-pack → agentshield-pack, research-pack; </w:t>
-            </w:r>
-            <w:r>
-              <w:rPr>
-                <w:rFonts w:ascii="Courier New" w:hAnsi="Courier New"/>
-                <w:color w:val="F05922"/>
-                <w:sz w:val="20"/>
-              </w:rPr>
-              <w:t>ecc2/</w:t>
-            </w:r>
-            <w:r>
-              <w:rPr>
-                <w:sz w:val="20"/>
-              </w:rPr>
-              <w:t xml:space="preserve"> modular structure</w:t>
+              <w:t xml:space="preserve"> dependency graph: runtime-core → workflow-pack → agentshield-pack, research-pack</w:t>
             </w:r>
           </w:p>
         </w:tc>
@@ -4196,9 +4275,70 @@
           <w:p>
             <w:r>
               <w:rPr>
+                <w:b/>
                 <w:sz w:val="20"/>
               </w:rPr>
-              <w:t>Dễ onboard agent mới; dễ bật/tắt theo project; giảm cognitive load khi maintain</w:t>
+              <w:t>Trước:</w:t>
+            </w:r>
+            <w:r>
+              <w:rPr>
+                <w:sz w:val="20"/>
+              </w:rPr>
+              <w:t xml:space="preserve"> khi 1 project con của KZTEK không cần DevOps/Migrate, toàn bộ agent vẫn nằm chung 1 danh sách phẳng trong </w:t>
+            </w:r>
+            <w:r>
+              <w:rPr>
+                <w:rFonts w:ascii="Courier New" w:hAnsi="Courier New"/>
+                <w:color w:val="F05922"/>
+                <w:sz w:val="20"/>
+              </w:rPr>
+              <w:t>.claude/agents/</w:t>
+            </w:r>
+            <w:r>
+              <w:rPr>
+                <w:sz w:val="20"/>
+              </w:rPr>
+              <w:t xml:space="preserve"> — không có cách "tắt" nhóm agent không liên quan theo project. </w:t>
+            </w:r>
+            <w:r>
+              <w:rPr>
+                <w:b/>
+                <w:sz w:val="20"/>
+              </w:rPr>
+              <w:t>Sau:</w:t>
+            </w:r>
+            <w:r>
+              <w:rPr>
+                <w:sz w:val="20"/>
+              </w:rPr>
+              <w:t xml:space="preserve"> có thể bật/tắt cả 1 tier (VD: tắt </w:t>
+            </w:r>
+            <w:r>
+              <w:rPr>
+                <w:rFonts w:ascii="Courier New" w:hAnsi="Courier New"/>
+                <w:color w:val="F05922"/>
+                <w:sz w:val="20"/>
+              </w:rPr>
+              <w:t>specialist/</w:t>
+            </w:r>
+            <w:r>
+              <w:rPr>
+                <w:sz w:val="20"/>
+              </w:rPr>
+              <w:t xml:space="preserve"> cho project nội bộ không cần migrate/research) bằng 1 thay đổi cấu hình, không phải sửa từng agent riêng lẻ. Đo được bằng: thời gian setup agent set cho 1 project mới giảm từ "chọn lọc thủ công 17 agent" xuống "chọn 2-3 tier". </w:t>
+            </w:r>
+            <w:r>
+              <w:rPr>
+                <w:b/>
+                <w:sz w:val="20"/>
+              </w:rPr>
+              <w:t>Cảnh báo:</w:t>
+            </w:r>
+            <w:r>
+              <w:rPr>
+                <w:sz w:val="20"/>
+              </w:rPr>
+              <w:t xml:space="preserve"> nếu phân loại tier sai, 1 workflow đang hoạt động (VD: WF-FEATURE cần ux-ui-reviewer) có thể "mất" agent cần dùng vì nó bị gán nhầm tier bị tắt.</w:t>
             </w:r>
           </w:p>
         </w:tc>
@@ -4217,7 +4357,7 @@
               <w:rPr>
                 <w:sz w:val="20"/>
               </w:rPr>
-              <w:t>Cao — structural refactor, rủi ro break existing workflows. Effort: 8-12h</w:t>
+              <w:t>Cao — structural refactor, rủi ro break existing workflows đang chạy ổn định. Effort: 8-12h</w:t>
             </w:r>
           </w:p>
         </w:tc>

</xml_diff>